<commit_message>
Add platform runbook and detailed regression evidence documentation.
Capture Design Center/Exchange/APIM operational steps and update regression results with validated DW endpoint outputs and synchronized Word documentation.

Made-with: Cursor
</commit_message>
<xml_diff>
--- a/docs/MASTER_DOCUMENTATION.docx
+++ b/docs/MASTER_DOCUMENTATION.docx
@@ -99,7 +99,27 @@
     </w:p>
     <w:p>
       <w:r>
-        <w:t>6. `docs/CURSOR_TDLC_METRICS_FILLED.md`</w:t>
+        <w:t>6. `docs/PLATFORM_OPERATIONS_RUNBOOK.md`</w:t>
+      </w:r>
+    </w:p>
+    <w:p>
+      <w:r>
+        <w:t xml:space="preserve">   - Step-by-step platform runbook for Design Center, Exchange, API instances, policies, and contracts.</w:t>
+      </w:r>
+    </w:p>
+    <w:p>
+      <w:r>
+        <w:t>7. `docs/REGRESSION_TEST_RESULTS_DETAILED.md`</w:t>
+      </w:r>
+    </w:p>
+    <w:p>
+      <w:r>
+        <w:t xml:space="preserve">   - Detailed happy/error-path matrix with input, expected output, and observed output.</w:t>
+      </w:r>
+    </w:p>
+    <w:p>
+      <w:r>
+        <w:t>8. `docs/CURSOR_TDLC_METRICS_FILLED.md`</w:t>
       </w:r>
     </w:p>
     <w:p>
@@ -109,7 +129,7 @@
     </w:p>
     <w:p>
       <w:r>
-        <w:t>7. `docs/EXECUTIVE_SCORECARD.md`</w:t>
+        <w:t>9. `docs/EXECUTIVE_SCORECARD.md`</w:t>
       </w:r>
     </w:p>
     <w:p>
@@ -783,6 +803,22 @@
         <w:pStyle w:val="ListBullet"/>
       </w:pPr>
       <w:r>
+        <w:t>`docs/PLATFORM_OPERATIONS_RUNBOOK.md` - Detailed runbook for asset creation, Design Center sync, API instance/policy operations, and contract/client app handling.</w:t>
+      </w:r>
+    </w:p>
+    <w:p>
+      <w:pPr>
+        <w:pStyle w:val="ListBullet"/>
+      </w:pPr>
+      <w:r>
+        <w:t>`docs/REGRESSION_TEST_RESULTS_DETAILED.md` - Scenario-level regression sheet with input/expected/observed results.</w:t>
+      </w:r>
+    </w:p>
+    <w:p>
+      <w:pPr>
+        <w:pStyle w:val="ListBullet"/>
+      </w:pPr>
+      <w:r>
         <w:t>`docs/CURSOR_TDLC_METRICS_FILLED.md` - Filled Cursor-specific TDLC metrics from attached matrix.</w:t>
       </w:r>
     </w:p>
@@ -3463,6 +3499,1037 @@
       </w:pPr>
       <w:r>
         <w:t>Documentation and repository push completed.</w:t>
+      </w:r>
+    </w:p>
+    <w:p>
+      <w:pPr>
+        <w:pStyle w:val="Heading1"/>
+      </w:pPr>
+      <w:r>
+        <w:t>Platform Operations Runbook</w:t>
+      </w:r>
+    </w:p>
+    <w:p>
+      <w:pPr>
+        <w:pStyle w:val="Heading1"/>
+      </w:pPr>
+      <w:r>
+        <w:t>Platform Operations Runbook (Assets, Design Center, API Manager, Contracts)</w:t>
+      </w:r>
+    </w:p>
+    <w:p/>
+    <w:p>
+      <w:r>
+        <w:t>This runbook captures the exact operational steps used for Exchange/Design Center/API Manager operations, including what was completed and what remains deferred.</w:t>
+      </w:r>
+    </w:p>
+    <w:p/>
+    <w:p>
+      <w:pPr>
+        <w:pStyle w:val="Heading2"/>
+      </w:pPr>
+      <w:r>
+        <w:t>1) Design Center Sync Steps</w:t>
+      </w:r>
+    </w:p>
+    <w:p/>
+    <w:p>
+      <w:pPr>
+        <w:pStyle w:val="Heading3"/>
+      </w:pPr>
+      <w:r>
+        <w:t>Goal</w:t>
+      </w:r>
+    </w:p>
+    <w:p>
+      <w:r>
+        <w:t>Sync RAML sources to Design Center project.</w:t>
+      </w:r>
+    </w:p>
+    <w:p/>
+    <w:p>
+      <w:pPr>
+        <w:pStyle w:val="Heading3"/>
+      </w:pPr>
+      <w:r>
+        <w:t>Steps Executed</w:t>
+      </w:r>
+    </w:p>
+    <w:p/>
+    <w:p>
+      <w:r>
+        <w:t>1. Create project:</w:t>
+      </w:r>
+    </w:p>
+    <w:p>
+      <w:r>
+        <w:t xml:space="preserve">   - `anypoint-cli-v4 designcenter project create "american-airlines-info-api" --type raml --client_id &lt;connectedAppId&gt; --client_secret &lt;connectedAppSecret&gt; --organization "Accenture" --environment "Sandbox"`</w:t>
+      </w:r>
+    </w:p>
+    <w:p>
+      <w:r>
+        <w:t>2. Upload RAML folder:</w:t>
+      </w:r>
+    </w:p>
+    <w:p>
+      <w:r>
+        <w:t xml:space="preserve">   - `anypoint-cli-v4 designcenter project upload "american-airlines-info-api" "src/main/resources/api" --client_id &lt;connectedAppId&gt; --client_secret &lt;connectedAppSecret&gt; --organization "Accenture" --environment "Sandbox"`</w:t>
+      </w:r>
+    </w:p>
+    <w:p/>
+    <w:p>
+      <w:pPr>
+        <w:pStyle w:val="Heading3"/>
+      </w:pPr>
+      <w:r>
+        <w:t>Outcome</w:t>
+      </w:r>
+    </w:p>
+    <w:p>
+      <w:pPr>
+        <w:pStyle w:val="ListBullet"/>
+      </w:pPr>
+      <w:r>
+        <w:t>Project created and uploaded successfully.</w:t>
+      </w:r>
+    </w:p>
+    <w:p/>
+    <w:p>
+      <w:pPr>
+        <w:pStyle w:val="Heading2"/>
+      </w:pPr>
+      <w:r>
+        <w:t>2) Exchange Asset Publication Steps</w:t>
+      </w:r>
+    </w:p>
+    <w:p/>
+    <w:p>
+      <w:pPr>
+        <w:pStyle w:val="Heading3"/>
+      </w:pPr>
+      <w:r>
+        <w:t>Goal</w:t>
+      </w:r>
+    </w:p>
+    <w:p>
+      <w:r>
+        <w:t>Publish API specification as Exchange `rest-api` asset.</w:t>
+      </w:r>
+    </w:p>
+    <w:p/>
+    <w:p>
+      <w:pPr>
+        <w:pStyle w:val="Heading3"/>
+      </w:pPr>
+      <w:r>
+        <w:t>Steps Executed</w:t>
+      </w:r>
+    </w:p>
+    <w:p/>
+    <w:p>
+      <w:r>
+        <w:t>1. Initial publish attempt for existing version (`1.0.0`) returned conflict (`409`) because lifecycle state was already published.</w:t>
+      </w:r>
+    </w:p>
+    <w:p>
+      <w:r>
+        <w:t>2. Published next version (`1.0.1`) using:</w:t>
+      </w:r>
+    </w:p>
+    <w:p>
+      <w:r>
+        <w:t xml:space="preserve">   - `./scripts/publish-api-spec.ps1 -ConnectedAppClientId &lt;id&gt; -ConnectedAppClientSecret &lt;secret&gt; -OrgId &lt;orgId&gt; -GroupId &lt;orgId&gt; -AssetId "american-airlines-info-api" -AssetVersion "1.0.1"`</w:t>
+      </w:r>
+    </w:p>
+    <w:p/>
+    <w:p>
+      <w:pPr>
+        <w:pStyle w:val="Heading3"/>
+      </w:pPr>
+      <w:r>
+        <w:t>Outcome</w:t>
+      </w:r>
+    </w:p>
+    <w:p>
+      <w:pPr>
+        <w:pStyle w:val="ListBullet"/>
+      </w:pPr>
+      <w:r>
+        <w:t>Exchange asset version `1.0.1` published.</w:t>
+      </w:r>
+    </w:p>
+    <w:p/>
+    <w:p>
+      <w:pPr>
+        <w:pStyle w:val="Heading2"/>
+      </w:pPr>
+      <w:r>
+        <w:t>3) Exchange Home-Page Documentation Steps</w:t>
+      </w:r>
+    </w:p>
+    <w:p/>
+    <w:p>
+      <w:pPr>
+        <w:pStyle w:val="Heading3"/>
+      </w:pPr>
+      <w:r>
+        <w:t>Goal</w:t>
+      </w:r>
+    </w:p>
+    <w:p>
+      <w:r>
+        <w:t>Ensure documentation is visible on Exchange home page.</w:t>
+      </w:r>
+    </w:p>
+    <w:p/>
+    <w:p>
+      <w:pPr>
+        <w:pStyle w:val="Heading3"/>
+      </w:pPr>
+      <w:r>
+        <w:t>Steps Executed</w:t>
+      </w:r>
+    </w:p>
+    <w:p/>
+    <w:p>
+      <w:r>
+        <w:t>1. Update draft home page:</w:t>
+      </w:r>
+    </w:p>
+    <w:p>
+      <w:r>
+        <w:t xml:space="preserve">   - `PUT /exchange/api/v1/assets/{groupId}/{assetId}/{version}/draft/pages/home`</w:t>
+      </w:r>
+    </w:p>
+    <w:p>
+      <w:r>
+        <w:t>2. Publish documentation state:</w:t>
+      </w:r>
+    </w:p>
+    <w:p>
+      <w:r>
+        <w:t xml:space="preserve">   - `PATCH /exchange/api/v1/assets/{groupId}/{assetId}/{version}` with `{"status":"published"}`</w:t>
+      </w:r>
+    </w:p>
+    <w:p/>
+    <w:p>
+      <w:pPr>
+        <w:pStyle w:val="Heading3"/>
+      </w:pPr>
+      <w:r>
+        <w:t>Outcome</w:t>
+      </w:r>
+    </w:p>
+    <w:p>
+      <w:pPr>
+        <w:pStyle w:val="ListBullet"/>
+      </w:pPr>
+      <w:r>
+        <w:t>Exchange home page now contains architecture + workflow + error-handling + lifecycle diagrams.</w:t>
+      </w:r>
+    </w:p>
+    <w:p/>
+    <w:p>
+      <w:pPr>
+        <w:pStyle w:val="Heading2"/>
+      </w:pPr>
+      <w:r>
+        <w:t>4) API Manager Instance and Policy Steps</w:t>
+      </w:r>
+    </w:p>
+    <w:p/>
+    <w:p>
+      <w:pPr>
+        <w:pStyle w:val="Heading3"/>
+      </w:pPr>
+      <w:r>
+        <w:t>Goal</w:t>
+      </w:r>
+    </w:p>
+    <w:p>
+      <w:r>
+        <w:t>Create/manage API instances, policies, and contract prerequisites.</w:t>
+      </w:r>
+    </w:p>
+    <w:p/>
+    <w:p>
+      <w:pPr>
+        <w:pStyle w:val="Heading3"/>
+      </w:pPr>
+      <w:r>
+        <w:t>Steps Executed</w:t>
+      </w:r>
+    </w:p>
+    <w:p/>
+    <w:p>
+      <w:pPr>
+        <w:pStyle w:val="ListBullet"/>
+      </w:pPr>
+      <w:r>
+        <w:t>Used `scripts/setup-api-manager.ps1` and direct APIM API operations for:</w:t>
+      </w:r>
+    </w:p>
+    <w:p>
+      <w:r>
+        <w:t xml:space="preserve">  - API instance creation attempts</w:t>
+      </w:r>
+    </w:p>
+    <w:p>
+      <w:r>
+        <w:t xml:space="preserve">  - policy setup attempts (basic auth / client-id patterns)</w:t>
+      </w:r>
+    </w:p>
+    <w:p>
+      <w:r>
+        <w:t xml:space="preserve">  - SLA tier creation</w:t>
+      </w:r>
+    </w:p>
+    <w:p>
+      <w:r>
+        <w:t xml:space="preserve">  - contract revoke and duplicate cleanup</w:t>
+      </w:r>
+    </w:p>
+    <w:p/>
+    <w:p>
+      <w:pPr>
+        <w:pStyle w:val="Heading3"/>
+      </w:pPr>
+      <w:r>
+        <w:t>State Summary</w:t>
+      </w:r>
+    </w:p>
+    <w:p/>
+    <w:p>
+      <w:pPr>
+        <w:pStyle w:val="ListBullet"/>
+      </w:pPr>
+      <w:r>
+        <w:t>Duplicate/obsolete API instances were removed.</w:t>
+      </w:r>
+    </w:p>
+    <w:p>
+      <w:pPr>
+        <w:pStyle w:val="ListBullet"/>
+      </w:pPr>
+      <w:r>
+        <w:t>Minimal validation instance and related deployment were cleaned up.</w:t>
+      </w:r>
+    </w:p>
+    <w:p>
+      <w:pPr>
+        <w:pStyle w:val="ListBullet"/>
+      </w:pPr>
+      <w:r>
+        <w:t>Single target instance retained for actual app follow-up (`20817134`).</w:t>
+      </w:r>
+    </w:p>
+    <w:p>
+      <w:pPr>
+        <w:pStyle w:val="ListBullet"/>
+      </w:pPr>
+      <w:r>
+        <w:t>APIM registration pairing is intentionally deferred as agreed.</w:t>
+      </w:r>
+    </w:p>
+    <w:p/>
+    <w:p>
+      <w:pPr>
+        <w:pStyle w:val="Heading2"/>
+      </w:pPr>
+      <w:r>
+        <w:t>5) Client App and Contracts</w:t>
+      </w:r>
+    </w:p>
+    <w:p/>
+    <w:p>
+      <w:pPr>
+        <w:pStyle w:val="Heading3"/>
+      </w:pPr>
+      <w:r>
+        <w:t>What was done</w:t>
+      </w:r>
+    </w:p>
+    <w:p/>
+    <w:p>
+      <w:pPr>
+        <w:pStyle w:val="ListBullet"/>
+      </w:pPr>
+      <w:r>
+        <w:t>Existing contracts on obsolete instances were revoked before deletion.</w:t>
+      </w:r>
+    </w:p>
+    <w:p>
+      <w:pPr>
+        <w:pStyle w:val="ListBullet"/>
+      </w:pPr>
+      <w:r>
+        <w:t>This prevented stale instance buildup.</w:t>
+      </w:r>
+    </w:p>
+    <w:p/>
+    <w:p>
+      <w:pPr>
+        <w:pStyle w:val="Heading3"/>
+      </w:pPr>
+      <w:r>
+        <w:t>What remains (deferred by scope)</w:t>
+      </w:r>
+    </w:p>
+    <w:p/>
+    <w:p>
+      <w:pPr>
+        <w:pStyle w:val="ListBullet"/>
+      </w:pPr>
+      <w:r>
+        <w:t>Create new client apps per SLA tier against final stabilized API instance.</w:t>
+      </w:r>
+    </w:p>
+    <w:p>
+      <w:pPr>
+        <w:pStyle w:val="ListBullet"/>
+      </w:pPr>
+      <w:r>
+        <w:t>Generate and distribute final `client_id` / `client_secret` for consumers.</w:t>
+      </w:r>
+    </w:p>
+    <w:p>
+      <w:pPr>
+        <w:pStyle w:val="ListBullet"/>
+      </w:pPr>
+      <w:r>
+        <w:t>Validate contract visibility and policy enforcement post-registration.</w:t>
+      </w:r>
+    </w:p>
+    <w:p/>
+    <w:p>
+      <w:pPr>
+        <w:pStyle w:val="Heading2"/>
+      </w:pPr>
+      <w:r>
+        <w:t>6) Asset/Type Governance Pain Point (Important)</w:t>
+      </w:r>
+    </w:p>
+    <w:p/>
+    <w:p>
+      <w:pPr>
+        <w:pStyle w:val="ListBullet"/>
+      </w:pPr>
+      <w:r>
+        <w:t>Exchange enforces asset type boundaries (`rest-api` vs app deployable asset).</w:t>
+      </w:r>
+    </w:p>
+    <w:p>
+      <w:pPr>
+        <w:pStyle w:val="ListBullet"/>
+      </w:pPr>
+      <w:r>
+        <w:t>A `rest-api` identity cannot always be reused as deployable app artifact type.</w:t>
+      </w:r>
+    </w:p>
+    <w:p>
+      <w:pPr>
+        <w:pStyle w:val="ListBullet"/>
+      </w:pPr>
+      <w:r>
+        <w:t>This was a key root cause in platform alignment friction.</w:t>
+      </w:r>
+    </w:p>
+    <w:p/>
+    <w:p>
+      <w:pPr>
+        <w:pStyle w:val="Heading2"/>
+      </w:pPr>
+      <w:r>
+        <w:t>7) Recommended Finalization Checklist</w:t>
+      </w:r>
+    </w:p>
+    <w:p/>
+    <w:p>
+      <w:r>
+        <w:t>1. Stabilize APIM registration for final instance.</w:t>
+      </w:r>
+    </w:p>
+    <w:p>
+      <w:r>
+        <w:t>2. Create client applications (Bronze/Silver) and approve contracts.</w:t>
+      </w:r>
+    </w:p>
+    <w:p>
+      <w:r>
+        <w:t>3. Run policy-enforced Postman suite with issued client credentials.</w:t>
+      </w:r>
+    </w:p>
+    <w:p>
+      <w:r>
+        <w:t>4. Record final credentials handoff and API governance state.</w:t>
+      </w:r>
+    </w:p>
+    <w:p>
+      <w:pPr>
+        <w:pStyle w:val="Heading1"/>
+      </w:pPr>
+      <w:r>
+        <w:t>Detailed Regression Test Results</w:t>
+      </w:r>
+    </w:p>
+    <w:p>
+      <w:pPr>
+        <w:pStyle w:val="Heading1"/>
+      </w:pPr>
+      <w:r>
+        <w:t>Detailed Regression Test Results (Happy Path + Error Path)</w:t>
+      </w:r>
+    </w:p>
+    <w:p/>
+    <w:p>
+      <w:r>
+        <w:t>This sheet tracks endpoint-level regression scenarios with explicit inputs, expected behavior, and observed behavior.</w:t>
+      </w:r>
+    </w:p>
+    <w:p/>
+    <w:p>
+      <w:pPr>
+        <w:pStyle w:val="Heading2"/>
+      </w:pPr>
+      <w:r>
+        <w:t>1) Test Environment</w:t>
+      </w:r>
+    </w:p>
+    <w:p/>
+    <w:p>
+      <w:pPr>
+        <w:pStyle w:val="ListBullet"/>
+      </w:pPr>
+      <w:r>
+        <w:t>Base URL: `https://american-airlines-info-app-dev-jjvb3b.5sc6y6-3.usa-e2.cloudhub.io`</w:t>
+      </w:r>
+    </w:p>
+    <w:p>
+      <w:pPr>
+        <w:pStyle w:val="ListBullet"/>
+      </w:pPr>
+      <w:r>
+        <w:t>Runtime target: `american-airlines-info-app-dev`</w:t>
+      </w:r>
+    </w:p>
+    <w:p>
+      <w:pPr>
+        <w:pStyle w:val="ListBullet"/>
+      </w:pPr>
+      <w:r>
+        <w:t>Method: cURL smoke/regression runs with representative payloads</w:t>
+      </w:r>
+    </w:p>
+    <w:p/>
+    <w:p>
+      <w:pPr>
+        <w:pStyle w:val="Heading2"/>
+      </w:pPr>
+      <w:r>
+        <w:t>2) API Services - Happy Paths</w:t>
+      </w:r>
+    </w:p>
+    <w:p/>
+    <w:p>
+      <w:r>
+        <w:t>| ID | Endpoint | Input | Expected | Observed | Result |</w:t>
+      </w:r>
+    </w:p>
+    <w:p>
+      <w:r>
+        <w:t>|---|---|---|---|---|---|</w:t>
+      </w:r>
+    </w:p>
+    <w:p>
+      <w:r>
+        <w:t>| HP-01 | `GET /api/flights` | none | `200` with list payload | `200` | Pass |</w:t>
+      </w:r>
+    </w:p>
+    <w:p>
+      <w:r>
+        <w:t>| HP-02 | `GET /api/flights?destination=SFO` | query param `destination=SFO` | `200` filtered list | `200` | Pass |</w:t>
+      </w:r>
+    </w:p>
+    <w:p>
+      <w:r>
+        <w:t>| HP-03 | `GET /api/flights/{ID}` | `ID=903777` | `200` single-flight payload | `200` | Pass |</w:t>
+      </w:r>
+    </w:p>
+    <w:p>
+      <w:r>
+        <w:t>| HP-04 | `POST /dw/simple` | JSON with `Field1` and `phoneNumber` | `200`, uppercase + de-hyphenated phone + bookingDate | `200` | Pass |</w:t>
+      </w:r>
+    </w:p>
+    <w:p>
+      <w:r>
+        <w:t>| HP-05 | `POST /dw/complex` | XML flights/options payload | `200`, extracted option IDs + seat filter + pricing transform | `200` | Pass |</w:t>
+      </w:r>
+    </w:p>
+    <w:p>
+      <w:r>
+        <w:t>| HP-06 | `POST /dw/multi1` | Passenger JSON with baggage and travelDate | `200`, XML PNR output with baggage split + date format | `200` | Pass |</w:t>
+      </w:r>
+    </w:p>
+    <w:p>
+      <w:r>
+        <w:t>| HP-07 | `POST /dw/multi2` | XML flights payload | `200`, JSON array with CANCELLED removed and route/status mapping | `200` | Pass |</w:t>
+      </w:r>
+    </w:p>
+    <w:p/>
+    <w:p>
+      <w:pPr>
+        <w:pStyle w:val="Heading2"/>
+      </w:pPr>
+      <w:r>
+        <w:t>3) API Services - Error/Negative Paths</w:t>
+      </w:r>
+    </w:p>
+    <w:p/>
+    <w:p>
+      <w:r>
+        <w:t>| ID | Endpoint | Input | Expected | Observed | Result |</w:t>
+      </w:r>
+    </w:p>
+    <w:p>
+      <w:r>
+        <w:t>|---|---|---|---|---|---|</w:t>
+      </w:r>
+    </w:p>
+    <w:p>
+      <w:r>
+        <w:t>| ER-01 | `DELETE /api/flights/{ID}` | missing `ID=9999999` | `404` not found mapping | `404` | Pass |</w:t>
+      </w:r>
+    </w:p>
+    <w:p>
+      <w:r>
+        <w:t>| ER-02 | `PUT /api/flights/{ID}` | invalid/incomplete update payload | `400` validation error | `400` | Pass |</w:t>
+      </w:r>
+    </w:p>
+    <w:p>
+      <w:r>
+        <w:t>| ER-03 | `POST /api/flights/batch` | malformed/invalid batch payload | `400` validation error | `400` | Pass |</w:t>
+      </w:r>
+    </w:p>
+    <w:p/>
+    <w:p>
+      <w:pPr>
+        <w:pStyle w:val="Heading2"/>
+      </w:pPr>
+      <w:r>
+        <w:t>4) Scenarios Requiring Follow-up in Next Cycle</w:t>
+      </w:r>
+    </w:p>
+    <w:p/>
+    <w:p>
+      <w:r>
+        <w:t>| ID | Endpoint | Input | Expected | Observed | Status |</w:t>
+      </w:r>
+    </w:p>
+    <w:p>
+      <w:r>
+        <w:t>|---|---|---|---|---|---|</w:t>
+      </w:r>
+    </w:p>
+    <w:p>
+      <w:r>
+        <w:t>| FU-01 | `POST /api/flights` | create payload for new ID | `201`/`200` create success | `500` in latest smoke run | Needs investigation |</w:t>
+      </w:r>
+    </w:p>
+    <w:p>
+      <w:r>
+        <w:t>| FU-02 | `DELETE /api/flights/{ID}` | previously created ID | `200` or `204` delete success | `404` when create step failed | Blocked by FU-01 |</w:t>
+      </w:r>
+    </w:p>
+    <w:p/>
+    <w:p>
+      <w:pPr>
+        <w:pStyle w:val="Heading2"/>
+      </w:pPr>
+      <w:r>
+        <w:t>5) Representative Inputs Used</w:t>
+      </w:r>
+    </w:p>
+    <w:p/>
+    <w:p>
+      <w:pPr>
+        <w:pStyle w:val="Heading3"/>
+      </w:pPr>
+      <w:r>
+        <w:t>5.1 `POST /api/flights` sample</w:t>
+      </w:r>
+    </w:p>
+    <w:p/>
+    <w:p>
+      <w:r>
+        <w:t>```json</w:t>
+      </w:r>
+    </w:p>
+    <w:p>
+      <w:r>
+        <w:t>{</w:t>
+      </w:r>
+    </w:p>
+    <w:p>
+      <w:r>
+        <w:t xml:space="preserve">  "ID": 904111,</w:t>
+      </w:r>
+    </w:p>
+    <w:p>
+      <w:r>
+        <w:t xml:space="preserve">  "code": "AA904111",</w:t>
+      </w:r>
+    </w:p>
+    <w:p>
+      <w:r>
+        <w:t xml:space="preserve">  "price": 450,</w:t>
+      </w:r>
+    </w:p>
+    <w:p>
+      <w:r>
+        <w:t xml:space="preserve">  "departureDate": "2026-07-01T10:00:00Z",</w:t>
+      </w:r>
+    </w:p>
+    <w:p>
+      <w:r>
+        <w:t xml:space="preserve">  "origin": "CLE",</w:t>
+      </w:r>
+    </w:p>
+    <w:p>
+      <w:r>
+        <w:t xml:space="preserve">  "destination": "SFO",</w:t>
+      </w:r>
+    </w:p>
+    <w:p>
+      <w:r>
+        <w:t xml:space="preserve">  "emptySeats": 25,</w:t>
+      </w:r>
+    </w:p>
+    <w:p>
+      <w:r>
+        <w:t xml:space="preserve">  "plane": {</w:t>
+      </w:r>
+    </w:p>
+    <w:p>
+      <w:r>
+        <w:t xml:space="preserve">    "type": "Boeing 737",</w:t>
+      </w:r>
+    </w:p>
+    <w:p>
+      <w:r>
+        <w:t xml:space="preserve">    "totalSeats": 180</w:t>
+      </w:r>
+    </w:p>
+    <w:p>
+      <w:r>
+        <w:t xml:space="preserve">  }</w:t>
+      </w:r>
+    </w:p>
+    <w:p>
+      <w:r>
+        <w:t>}</w:t>
+      </w:r>
+    </w:p>
+    <w:p>
+      <w:r>
+        <w:t>```</w:t>
+      </w:r>
+    </w:p>
+    <w:p/>
+    <w:p>
+      <w:pPr>
+        <w:pStyle w:val="Heading3"/>
+      </w:pPr>
+      <w:r>
+        <w:t>5.2 `POST /dw/simple` sample</w:t>
+      </w:r>
+    </w:p>
+    <w:p/>
+    <w:p>
+      <w:r>
+        <w:t>```json</w:t>
+      </w:r>
+    </w:p>
+    <w:p>
+      <w:r>
+        <w:t>{</w:t>
+      </w:r>
+    </w:p>
+    <w:p>
+      <w:r>
+        <w:t xml:space="preserve">  "Field1": "hello",</w:t>
+      </w:r>
+    </w:p>
+    <w:p>
+      <w:r>
+        <w:t xml:space="preserve">  "phoneNumber": "555-111-2222"</w:t>
+      </w:r>
+    </w:p>
+    <w:p>
+      <w:r>
+        <w:t>}</w:t>
+      </w:r>
+    </w:p>
+    <w:p>
+      <w:r>
+        <w:t>```</w:t>
+      </w:r>
+    </w:p>
+    <w:p/>
+    <w:p>
+      <w:pPr>
+        <w:pStyle w:val="Heading3"/>
+      </w:pPr>
+      <w:r>
+        <w:t>5.3 `POST /dw/complex` sample</w:t>
+      </w:r>
+    </w:p>
+    <w:p/>
+    <w:p>
+      <w:r>
+        <w:t>```xml</w:t>
+      </w:r>
+    </w:p>
+    <w:p>
+      <w:r>
+        <w:t>&lt;orders&gt;</w:t>
+      </w:r>
+    </w:p>
+    <w:p>
+      <w:r>
+        <w:t xml:space="preserve">  &lt;order&gt;</w:t>
+      </w:r>
+    </w:p>
+    <w:p>
+      <w:r>
+        <w:t xml:space="preserve">    &lt;id&gt;1&lt;/id&gt;</w:t>
+      </w:r>
+    </w:p>
+    <w:p>
+      <w:r>
+        <w:t xml:space="preserve">    &lt;amount&gt;100&lt;/amount&gt;</w:t>
+      </w:r>
+    </w:p>
+    <w:p>
+      <w:r>
+        <w:t xml:space="preserve">  &lt;/order&gt;</w:t>
+      </w:r>
+    </w:p>
+    <w:p>
+      <w:r>
+        <w:t>&lt;/orders&gt;</w:t>
+      </w:r>
+    </w:p>
+    <w:p>
+      <w:r>
+        <w:t>```</w:t>
+      </w:r>
+    </w:p>
+    <w:p/>
+    <w:p>
+      <w:pPr>
+        <w:pStyle w:val="Heading2"/>
+      </w:pPr>
+      <w:r>
+        <w:t>6) Notes</w:t>
+      </w:r>
+    </w:p>
+    <w:p/>
+    <w:p>
+      <w:pPr>
+        <w:pStyle w:val="ListBullet"/>
+      </w:pPr>
+      <w:r>
+        <w:t>This document is intentionally evidence-first: if a scenario failed in the latest regression run, it is marked as follow-up instead of being reported as pass.</w:t>
+      </w:r>
+    </w:p>
+    <w:p>
+      <w:pPr>
+        <w:pStyle w:val="ListBullet"/>
+      </w:pPr>
+      <w:r>
+        <w:t>Initial `500` signals observed for `/dw/simple` and `/dw/multi1` were caused by malformed JSON in PowerShell inline-curl quoting, not DW logic defects. File-based payload retest confirmed both endpoints return expected output (`200`).</w:t>
+      </w:r>
+    </w:p>
+    <w:p>
+      <w:pPr>
+        <w:pStyle w:val="ListBullet"/>
+      </w:pPr>
+      <w:r>
+        <w:t>Full runnable request definitions are maintained in:</w:t>
+      </w:r>
+    </w:p>
+    <w:p>
+      <w:r>
+        <w:t xml:space="preserve">  - `postman/american-airlines-info-api-playground.postman_collection.json`</w:t>
+      </w:r>
+    </w:p>
+    <w:p>
+      <w:r>
+        <w:t xml:space="preserve">  - `postman/american-airlines-info-api-cloudhub.postman_environment.json`</w:t>
+      </w:r>
+    </w:p>
+    <w:p>
+      <w:r>
+        <w:t xml:space="preserve">  - `postman/american-airlines-info-api-local.postman_environment.json`</w:t>
+      </w:r>
+    </w:p>
+    <w:p/>
+    <w:p>
+      <w:pPr>
+        <w:pStyle w:val="Heading2"/>
+      </w:pPr>
+      <w:r>
+        <w:t>7) Latest DW Output Evidence (Validated)</w:t>
+      </w:r>
+    </w:p>
+    <w:p/>
+    <w:p>
+      <w:pPr>
+        <w:pStyle w:val="Heading3"/>
+      </w:pPr>
+      <w:r>
+        <w:t>7.1 `/dw/simple` observed output (`200`)</w:t>
+      </w:r>
+    </w:p>
+    <w:p/>
+    <w:p>
+      <w:r>
+        <w:t>```json</w:t>
+      </w:r>
+    </w:p>
+    <w:p>
+      <w:r>
+        <w:t>{</w:t>
+      </w:r>
+    </w:p>
+    <w:p>
+      <w:r>
+        <w:t xml:space="preserve">  "Field2": "HELLO",</w:t>
+      </w:r>
+    </w:p>
+    <w:p>
+      <w:r>
+        <w:t xml:space="preserve">  "phoneNumber": "5551112222",</w:t>
+      </w:r>
+    </w:p>
+    <w:p>
+      <w:r>
+        <w:t xml:space="preserve">  "bookingDate": "2026-03-27T19:18:16Z"</w:t>
+      </w:r>
+    </w:p>
+    <w:p>
+      <w:r>
+        <w:t>}</w:t>
+      </w:r>
+    </w:p>
+    <w:p>
+      <w:r>
+        <w:t>```</w:t>
+      </w:r>
+    </w:p>
+    <w:p/>
+    <w:p>
+      <w:pPr>
+        <w:pStyle w:val="Heading3"/>
+      </w:pPr>
+      <w:r>
+        <w:t>7.2 `/dw/multi1` observed output (`200`)</w:t>
+      </w:r>
+    </w:p>
+    <w:p/>
+    <w:p>
+      <w:r>
+        <w:t>```xml</w:t>
+      </w:r>
+    </w:p>
+    <w:p>
+      <w:r>
+        <w:t>&lt;?xml version='1.0' encoding='UTF-8'?&gt;</w:t>
+      </w:r>
+    </w:p>
+    <w:p>
+      <w:r>
+        <w:t>&lt;pnrData&gt;</w:t>
+      </w:r>
+    </w:p>
+    <w:p>
+      <w:r>
+        <w:t xml:space="preserve">  &lt;passengerName&gt;Jane Doe&lt;/passengerName&gt;</w:t>
+      </w:r>
+    </w:p>
+    <w:p>
+      <w:r>
+        <w:t xml:space="preserve">  &lt;flightNumber&gt;AA450&lt;/flightNumber&gt;</w:t>
+      </w:r>
+    </w:p>
+    <w:p>
+      <w:r>
+        <w:t xml:space="preserve">  &lt;travelDate&gt;2026-04-15&lt;/travelDate&gt;</w:t>
+      </w:r>
+    </w:p>
+    <w:p>
+      <w:r>
+        <w:t xml:space="preserve">  &lt;specialAssistance&gt;true&lt;/specialAssistance&gt;</w:t>
+      </w:r>
+    </w:p>
+    <w:p>
+      <w:r>
+        <w:t xml:space="preserve">  &lt;baggage&gt;</w:t>
+      </w:r>
+    </w:p>
+    <w:p>
+      <w:r>
+        <w:t xml:space="preserve">    &lt;normalBaggage&gt;</w:t>
+      </w:r>
+    </w:p>
+    <w:p>
+      <w:r>
+        <w:t xml:space="preserve">      &lt;id&gt;B1&lt;/id&gt;</w:t>
+      </w:r>
+    </w:p>
+    <w:p>
+      <w:r>
+        <w:t xml:space="preserve">      &lt;weightKg&gt;20&lt;/weightKg&gt;</w:t>
+      </w:r>
+    </w:p>
+    <w:p>
+      <w:r>
+        <w:t xml:space="preserve">    &lt;/normalBaggage&gt;</w:t>
+      </w:r>
+    </w:p>
+    <w:p>
+      <w:r>
+        <w:t xml:space="preserve">    &lt;heavyBaggage&gt;</w:t>
+      </w:r>
+    </w:p>
+    <w:p>
+      <w:r>
+        <w:t xml:space="preserve">      &lt;id&gt;B2&lt;/id&gt;</w:t>
+      </w:r>
+    </w:p>
+    <w:p>
+      <w:r>
+        <w:t xml:space="preserve">      &lt;weightKg&gt;35&lt;/weightKg&gt;</w:t>
+      </w:r>
+    </w:p>
+    <w:p>
+      <w:r>
+        <w:t xml:space="preserve">    &lt;/heavyBaggage&gt;</w:t>
+      </w:r>
+    </w:p>
+    <w:p>
+      <w:r>
+        <w:t xml:space="preserve">  &lt;/baggage&gt;</w:t>
+      </w:r>
+    </w:p>
+    <w:p>
+      <w:r>
+        <w:t>&lt;/pnrData&gt;</w:t>
+      </w:r>
+    </w:p>
+    <w:p>
+      <w:r>
+        <w:t>```</w:t>
       </w:r>
     </w:p>
     <w:p>

</xml_diff>

<commit_message>
Update prompt ledger with code review activity and refresh documentation pack.
Record the code-review deliverable in the execution ledger and regenerate the consolidated Word documentation artifact.

Made-with: Cursor
</commit_message>
<xml_diff>
--- a/docs/MASTER_DOCUMENTATION.docx
+++ b/docs/MASTER_DOCUMENTATION.docx
@@ -3164,6 +3164,11 @@
         <w:t>|18 | Push to remote git repo | Initial commit and push to provided GitHub URL | `git add/commit`, `git remote add`, `git push -u origin master` | Observed push ~35-40 secs |</w:t>
       </w:r>
     </w:p>
+    <w:p>
+      <w:r>
+        <w:t>|19 | Perform unbiased code review and publish findings | Added dedicated review doc with prioritized remediation plan and indexed it in docs | `docs/CODE_REVIEW_COMMENTS_AND_FIXES_PROPOSED.md`, index updates, doc pack regeneration | Approx 20-40 mins |</w:t>
+      </w:r>
+    </w:p>
     <w:p/>
     <w:p>
       <w:pPr>
@@ -3517,6 +3522,14 @@
       </w:pPr>
       <w:r>
         <w:t>Documentation and repository push completed.</w:t>
+      </w:r>
+    </w:p>
+    <w:p>
+      <w:pPr>
+        <w:pStyle w:val="ListBullet"/>
+      </w:pPr>
+      <w:r>
+        <w:t>Dedicated code review findings and fix proposals published and indexed.</w:t>
       </w:r>
     </w:p>
     <w:p>

</xml_diff>